<commit_message>
Regenerate real life capability bank package
</commit_message>
<xml_diff>
--- a/docs/community-setup-pack/GSN_CORE_CAPABILITY_SET_2026-09-14.docx
+++ b/docs/community-setup-pack/GSN_CORE_CAPABILITY_SET_2026-09-14.docx
@@ -49,7 +49,7 @@
     </w:p>
     <w:p>
       <w:r>
-        <w:t>Use GSN Core Capabilities for public-facing app surfaces, executive summaries, first conversations, and ordinary client/member explanation. The larger `GSN in Real Life` bank remains the controlled setup source for deeper rollout, audience selection, upgrades and operator work.</w:t>
+        <w:t>Use GSN Core Capabilities for public-facing app surfaces, executive summaries, first conversations, and ordinary client/member explanation. The larger `GSN in Real Life` bank remains the controlled setup source for deeper rollout, audience selection, upgrades, operator work and Strategic Application Lenses.</w:t>
       </w:r>
     </w:p>
     <w:p>
@@ -293,7 +293,7 @@
     </w:p>
     <w:p>
       <w:r>
-        <w:t>The 44-module `GSN in Real Life` bank remains useful, but it should not be the default public front.</w:t>
+        <w:t>The expanded `GSN in Real Life` bank preserves the 44 original modules and adds Strategic Application Lenses, but it should not be the default public front.</w:t>
       </w:r>
     </w:p>
     <w:p>

</xml_diff>